<commit_message>
Fiche EPP : formulation adaptée à une remise pendant l'entretien
Texte au présent (« cet entretien », « nous y faisons le point ensemble »),
surtitre « Fiche remise lors de votre entretien », encadrés à compléter
ensemble pendant l'échange et champs « Entretien du / Mené par / Contact RH »
à la place de « Fiche remise le ».

Co-Authored-By: Claude Opus 5.5 <noreply@anthropic.com>
Claude-Session: https://claude.ai/code/session_017zLT3dFfTsN6o1Gwcudkmu
</commit_message>
<xml_diff>
--- a/outils/fiche-recap-entretien-parcours-professionnel/Fiche_recap_entretien_parcours_professionnel.docx
+++ b/outils/fiche-recap-entretien-parcours-professionnel/Fiche_recap_entretien_parcours_professionnel.docx
@@ -59,7 +59,7 @@
           <w:sz w:val="15"/>
           <w:szCs w:val="15"/>
         </w:rPr>
-        <w:t xml:space="preserve">FICHE RÉCAPITULATIVE</w:t>
+        <w:t xml:space="preserve">FICHE REMISE LORS DE VOTRE ENTRETIEN</w:t>
       </w:r>
     </w:p>
     <w:p>
@@ -113,7 +113,7 @@
           <w:sz w:val="19"/>
           <w:szCs w:val="19"/>
         </w:rPr>
-        <w:t xml:space="preserve">Un temps d’échange consacré à </w:t>
+        <w:t xml:space="preserve">Cet entretien est un temps d’échange consacré à </w:t>
       </w:r>
       <w:r>
         <w:rPr>
@@ -131,7 +131,7 @@
           <w:sz w:val="19"/>
           <w:szCs w:val="19"/>
         </w:rPr>
-        <w:t xml:space="preserve"> (compétences, qualifications, formation, mobilité, reconversion), qui </w:t>
+        <w:t xml:space="preserve"> (compétences, formation, mobilité, reconversion) ; il </w:t>
       </w:r>
       <w:r>
         <w:rPr>
@@ -149,7 +149,7 @@
           <w:sz w:val="19"/>
           <w:szCs w:val="19"/>
         </w:rPr>
-        <w:t xml:space="preserve">. Il a lieu dans l’année suivant votre embauche puis tous les 4 ans, et donne lieu à un compte rendu écrit dont vous recevez une copie.</w:t>
+        <w:t xml:space="preserve">. Nous y faisons le point ensemble sur les quatre dispositifs de cette fiche, que vous conservez. Il donne lieu à un compte rendu écrit dont vous recevez une copie.</w:t>
       </w:r>
     </w:p>
     <w:p>
@@ -1940,7 +1940,7 @@
           <w:sz w:val="17"/>
           <w:szCs w:val="17"/>
         </w:rPr>
-        <w:t xml:space="preserve">tout ou partie d’une certification professionnelle</w:t>
+        <w:t xml:space="preserve">tout ou partie d’un diplôme, d’un titre ou d’un CQP</w:t>
       </w:r>
       <w:r>
         <w:rPr>
@@ -1949,7 +1949,7 @@
           <w:sz w:val="17"/>
           <w:szCs w:val="17"/>
         </w:rPr>
-        <w:t xml:space="preserve"> (diplôme, titre, certificat de qualification professionnelle) grâce à votre expérience professionnelle, bénévole ou syndicale, </w:t>
+        <w:t xml:space="preserve"> grâce à votre expérience professionnelle, bénévole ou syndicale, </w:t>
       </w:r>
       <w:r>
         <w:rPr>
@@ -1967,7 +1967,7 @@
           <w:sz w:val="17"/>
           <w:szCs w:val="17"/>
         </w:rPr>
-        <w:t xml:space="preserve">. Candidature en ligne sur </w:t>
+        <w:t xml:space="preserve">. Candidature sur </w:t>
       </w:r>
       <w:r>
         <w:rPr>
@@ -1985,7 +1985,7 @@
           <w:sz w:val="17"/>
           <w:szCs w:val="17"/>
         </w:rPr>
-        <w:t xml:space="preserve"> en moins de 10 minutes ; le congé VAE se demande par écrit à votre employeur.</w:t>
+        <w:t xml:space="preserve"> ; congé VAE à demander par écrit à votre employeur.</w:t>
       </w:r>
     </w:p>
     <w:p>
@@ -2902,7 +2902,7 @@
                 <w:sz w:val="21"/>
                 <w:szCs w:val="21"/>
               </w:rPr>
-              <w:t xml:space="preserve">Parlez-en pendant votre entretien</w:t>
+              <w:t xml:space="preserve">Parlons-en dès aujourd’hui</w:t>
             </w:r>
           </w:p>
           <w:p>
@@ -2916,7 +2916,7 @@
                 <w:sz w:val="16"/>
                 <w:szCs w:val="16"/>
               </w:rPr>
-              <w:t xml:space="preserve">C’est le bon moment pour imaginer un projet de formation commun et son financement.</w:t>
+              <w:t xml:space="preserve">Cet entretien est le bon moment pour imaginer ensemble un projet de formation et son financement.</w:t>
             </w:r>
           </w:p>
         </w:tc>
@@ -3299,7 +3299,7 @@
                 <w:sz w:val="13"/>
                 <w:szCs w:val="13"/>
               </w:rPr>
-              <w:t xml:space="preserve">À L’ISSUE DE L’ENTRETIEN</w:t>
+              <w:t xml:space="preserve">À CONVENIR ENSEMBLE</w:t>
             </w:r>
           </w:p>
           <w:p>
@@ -3657,7 +3657,7 @@
                 <w:sz w:val="13"/>
                 <w:szCs w:val="13"/>
               </w:rPr>
-              <w:t xml:space="preserve">POUR GARDER LE FIL</w:t>
+              <w:t xml:space="preserve">PENDANT L’ENTRETIEN</w:t>
             </w:r>
           </w:p>
           <w:p>
@@ -3672,23 +3672,6 @@
                 <w:szCs w:val="26"/>
               </w:rPr>
               <w:t xml:space="preserve">Mes notes</w:t>
-            </w:r>
-          </w:p>
-          <w:p>
-            <w:pPr>
-              <w:tabs>
-                <w:tab w:val="left" w:pos="4493" w:leader="underscore"/>
-              </w:tabs>
-              <w:spacing w:after="0" w:before="190"/>
-            </w:pPr>
-            <w:r>
-              <w:rPr>
-                <w:rFonts w:ascii="Open Sans" w:cs="Open Sans" w:eastAsia="Open Sans" w:hAnsi="Open Sans"/>
-                <w:color w:val="BEBBBB"/>
-                <w:sz w:val="17"/>
-                <w:szCs w:val="17"/>
-              </w:rPr>
-              <w:t xml:space="preserve">	</w:t>
             </w:r>
           </w:p>
           <w:p>
@@ -3757,7 +3740,7 @@
                 <w:sz w:val="13"/>
                 <w:szCs w:val="13"/>
               </w:rPr>
-              <w:t xml:space="preserve">CONTACT RH  </w:t>
+              <w:t xml:space="preserve">ENTRETIEN DU  </w:t>
             </w:r>
             <w:r>
               <w:rPr>
@@ -3784,7 +3767,34 @@
                 <w:sz w:val="13"/>
                 <w:szCs w:val="13"/>
               </w:rPr>
-              <w:t xml:space="preserve">FICHE REMISE LE  </w:t>
+              <w:t xml:space="preserve">MENÉ PAR  </w:t>
+            </w:r>
+            <w:r>
+              <w:rPr>
+                <w:rFonts w:ascii="Open Sans" w:cs="Open Sans" w:eastAsia="Open Sans" w:hAnsi="Open Sans"/>
+                <w:color w:val="BEBBBB"/>
+                <w:sz w:val="17"/>
+                <w:szCs w:val="17"/>
+              </w:rPr>
+              <w:t xml:space="preserve">	</w:t>
+            </w:r>
+          </w:p>
+          <w:p>
+            <w:pPr>
+              <w:tabs>
+                <w:tab w:val="left" w:pos="4493" w:leader="underscore"/>
+              </w:tabs>
+              <w:spacing w:after="0" w:before="220"/>
+            </w:pPr>
+            <w:r>
+              <w:rPr>
+                <w:rFonts w:ascii="Poppins Medium" w:cs="Poppins Medium" w:eastAsia="Poppins Medium" w:hAnsi="Poppins Medium"/>
+                <w:color w:val="5F6B73"/>
+                <w:spacing w:val="30"/>
+                <w:sz w:val="13"/>
+                <w:szCs w:val="13"/>
+              </w:rPr>
+              <w:t xml:space="preserve">CONTACT RH  </w:t>
             </w:r>
             <w:r>
               <w:rPr>

</xml_diff>